<commit_message>
feat: selectable output language (English / bilingual / Chinese) + split README
- report_docx.build_report gains a `lang` param (en | zh | bilingual): switches
  both which captions render and all section-label languages.
- SKILL.md: output language is now a user choice (ask / infer; default bilingual).
- Heart-failure example ships the report in all three languages (EN / bilingual / ZH);
  make_report.py honors PAPERFIG_LANG.
- README split into English (README.md) and Chinese (README.zh-CN.md) with a switcher.

Co-Authored-By: Claude Opus 4.8 <noreply@anthropic.com>
</commit_message>
<xml_diff>
--- a/examples/heart-failure-survival/Figure_Report.docx
+++ b/examples/heart-failure-survival/Figure_Report.docx
@@ -12,7 +12,7 @@
           <w:color w:val="1F4E79"/>
           <w:sz w:val="36"/>
         </w:rPr>
-        <w:t>Figure &amp; Table Report / 图表报告</w:t>
+        <w:t>Figure &amp; Table Report</w:t>
       </w:r>
     </w:p>
     <w:p>
@@ -24,7 +24,7 @@
           <w:b w:val="0"/>
           <w:sz w:val="24"/>
         </w:rPr>
-        <w:t>Heart-failure survival — paper-figures worked example / 心衰生存分析案例</w:t>
+        <w:t>Heart-failure survival — paper-figures worked example</w:t>
       </w:r>
     </w:p>
     <w:p>
@@ -37,7 +37,7 @@
           <w:color w:val="1F4E79"/>
           <w:sz w:val="20"/>
         </w:rPr>
-        <w:t xml:space="preserve">Source paper / 来源论文: </w:t>
+        <w:t xml:space="preserve">Source paper: </w:t>
       </w:r>
       <w:r>
         <w:rPr>
@@ -56,7 +56,7 @@
           <w:color w:val="1F4E79"/>
           <w:sz w:val="20"/>
         </w:rPr>
-        <w:t xml:space="preserve">Data / 数据: </w:t>
+        <w:t xml:space="preserve">Data: </w:t>
       </w:r>
       <w:r>
         <w:rPr>
@@ -75,13 +75,13 @@
           <w:color w:val="1F4E79"/>
           <w:sz w:val="20"/>
         </w:rPr>
-        <w:t xml:space="preserve">Preset / 预设: </w:t>
+        <w:t xml:space="preserve">Preset: </w:t>
       </w:r>
       <w:r>
         <w:rPr>
           <w:sz w:val="20"/>
         </w:rPr>
-        <w:t>generic high-quality (single/double column)</w:t>
+        <w:t>generic high-quality</w:t>
       </w:r>
     </w:p>
     <w:p>
@@ -94,7 +94,7 @@
           <w:color w:val="1F4E79"/>
           <w:sz w:val="20"/>
         </w:rPr>
-        <w:t xml:space="preserve">Generated by / 生成: </w:t>
+        <w:t xml:space="preserve">Generated by: </w:t>
       </w:r>
       <w:r>
         <w:rPr>
@@ -180,7 +180,7 @@
               <w:rPr>
                 <w:sz w:val="18"/>
               </w:rPr>
-              <w:t>Fig 1</w:t>
+              <w:t>Figure 1</w:t>
             </w:r>
           </w:p>
         </w:tc>
@@ -221,7 +221,7 @@
               <w:rPr>
                 <w:sz w:val="18"/>
               </w:rPr>
-              <w:t>Fig 2</w:t>
+              <w:t>Figure 2</w:t>
             </w:r>
           </w:p>
         </w:tc>
@@ -262,7 +262,7 @@
               <w:rPr>
                 <w:sz w:val="18"/>
               </w:rPr>
-              <w:t>Fig 3</w:t>
+              <w:t>Figure 3</w:t>
             </w:r>
           </w:p>
         </w:tc>
@@ -303,7 +303,7 @@
               <w:rPr>
                 <w:sz w:val="18"/>
               </w:rPr>
-              <w:t>Fig 4</w:t>
+              <w:t>Figure 4</w:t>
             </w:r>
           </w:p>
         </w:tc>
@@ -344,7 +344,7 @@
               <w:rPr>
                 <w:sz w:val="18"/>
               </w:rPr>
-              <w:t>Fig 5</w:t>
+              <w:t>Figure 5</w:t>
             </w:r>
           </w:p>
         </w:tc>
@@ -385,7 +385,7 @@
               <w:rPr>
                 <w:sz w:val="18"/>
               </w:rPr>
-              <w:t>Fig 6</w:t>
+              <w:t>Figure 6</w:t>
             </w:r>
           </w:p>
         </w:tc>

</xml_diff>